<commit_message>
fix: update IM AS-IS and TO-BE IDEF0 models
</commit_message>
<xml_diff>
--- a/4/ИМ/ИМ_АлбахтинИВ_Отчёт.docx
+++ b/4/ИМ/ИМ_АлбахтинИВ_Отчёт.docx
@@ -2719,7 +2719,7 @@
         <w:pStyle w:val="IMBody"/>
       </w:pPr>
       <w:r>
-        <w:t>Ключевым информационным объектом процесса является спецификация изделия BOM. Она связывает корпус с набором комплектующих и правилами их совместимости. Один и тот же корпус может использоваться для нескольких конфигураций, а элемент BOM может задаваться точной моделью или группой характеристик. Поэтому изменение доступности, цены или модели компонента способно затронуть сразу несколько товарных предложений.</w:t>
+        <w:t>Ключевым информационным объектом процесса является спецификация изделия модельный ряд. Она связывает корпус с набором комплектующих и правилами их совместимости. Один и тот же корпус может использоваться для нескольких конфигураций, а элемент модельный ряд может задаваться точной моделью или группой характеристик. Поэтому изменение доступности, цены или модели компонента способно затронуть сразу несколько товарных предложений.</w:t>
       </w:r>
     </w:p>
     <w:p>
@@ -3123,7 +3123,7 @@
               <w:pStyle w:val="IMTable"/>
             </w:pPr>
             <w:r>
-              <w:t>BOM, характеристики и совместимость комплектующих, предложения поставщиков, остатки, цены, масса, изображения и статусы публикации</w:t>
+              <w:t>модельный ряд, характеристики и совместимость комплектующих, предложения поставщиков, остатки, цены, масса, изображения и статусы публикации</w:t>
             </w:r>
           </w:p>
         </w:tc>
@@ -3294,7 +3294,7 @@
               <w:pStyle w:val="IMTable"/>
             </w:pPr>
             <w:r>
-              <w:t>Создание и изменение BOM</w:t>
+              <w:t>Создание и изменение модельный ряд</w:t>
             </w:r>
           </w:p>
         </w:tc>
@@ -3596,7 +3596,7 @@
         <w:pStyle w:val="IMBody"/>
       </w:pPr>
       <w:r>
-        <w:t>2. Сотрудник производственного участка формирует BOM и выбирает компоненты.</w:t>
+        <w:t>2. Сотрудник производственного участка формирует модельный ряд и выбирает компоненты.</w:t>
       </w:r>
     </w:p>
     <w:p>
@@ -3604,7 +3604,7 @@
         <w:pStyle w:val="IMBody"/>
       </w:pPr>
       <w:r>
-        <w:t>3. Сведения поставщиков и склада сопоставляются с позициями BOM.</w:t>
+        <w:t>3. Сведения поставщиков и склада сопоставляются с позициями модельный ряд.</w:t>
       </w:r>
     </w:p>
     <w:p>
@@ -3851,7 +3851,7 @@
               <w:pStyle w:val="IMTable"/>
             </w:pPr>
             <w:r>
-              <w:t>BOM компьютерной системы</w:t>
+              <w:t>Модельный ряд компьютерной системы</w:t>
             </w:r>
           </w:p>
         </w:tc>
@@ -4441,7 +4441,7 @@
               <w:pStyle w:val="IMTable"/>
             </w:pPr>
             <w:r>
-              <w:t>BOM, расчёты и карточка ведутся раздельно</w:t>
+              <w:t>модельный ряд, расчёты и карточка ведутся раздельно</w:t>
             </w:r>
           </w:p>
         </w:tc>
@@ -4615,7 +4615,7 @@
               <w:pStyle w:val="IMTable"/>
             </w:pPr>
             <w:r>
-              <w:t>Нет анализа всех связанных BOM</w:t>
+              <w:t>Нет анализа всех связанных модельный ряд</w:t>
             </w:r>
           </w:p>
         </w:tc>
@@ -5367,7 +5367,7 @@
               <w:pStyle w:val="IMTable"/>
             </w:pPr>
             <w:r>
-              <w:t>BOM, совместимость компонентов и согласование замен</w:t>
+              <w:t>модельный ряд, совместимость компонентов и согласование замен</w:t>
             </w:r>
           </w:p>
         </w:tc>
@@ -5651,7 +5651,7 @@
         <w:pStyle w:val="IMBody"/>
       </w:pPr>
       <w:r>
-        <w:t>Автоматизация необходима прежде всего в точках, где одно изменение влияет на несколько объектов. Замена комплектующего должна автоматически находить связанные BOM, повторно проверять совместимость, пересчитывать цену и массу, отмечать затронутые карточки и сохранять историю. Без единого механизма зависимостей трудозатраты растут вместе с ассортиментом, а качество результата зависит от ручного контроля.</w:t>
+        <w:t>Автоматизация необходима прежде всего в точках, где одно изменение влияет на несколько объектов. Замена комплектующего должна автоматически находить связанные модельный ряд, повторно проверять совместимость, пересчитывать цену и массу, отмечать затронутые карточки и сохранять историю. Без единого механизма зависимостей трудозатраты растут вместе с ассортиментом, а качество результата зависит от ручного контроля.</w:t>
       </w:r>
     </w:p>
     <w:p>
@@ -5659,7 +5659,7 @@
         <w:pStyle w:val="IMBody"/>
       </w:pPr>
       <w:r>
-        <w:t>Целевая система должна стать единым источником данных о товарной конфигурации. В ней карточка Ozon связывается с конкретной версией BOM, предложения поставщиков - с внутренними компонентами, а правила совместимости, цены и веса - со справочниками. Неуспешная внешняя операция не должна приводить к потере подготовленных данных. Основные функции системы представлены в таблице 1.6.</w:t>
+        <w:t>Целевая система должна стать единым источником данных о товарной конфигурации. В ней карточка Ozon связывается с конкретной версией модельный ряд, предложения поставщиков - с внутренними компонентами, а правила совместимости, цены и веса - со справочниками. Неуспешная внешняя операция не должна приводить к потере подготовленных данных. Основные функции системы представлены в таблице 1.6.</w:t>
       </w:r>
     </w:p>
     <w:p>
@@ -5792,7 +5792,7 @@
               <w:pStyle w:val="IMTable"/>
             </w:pPr>
             <w:r>
-              <w:t>Создание и версионирование BOM</w:t>
+              <w:t>Создание и версионирование модельный ряд</w:t>
             </w:r>
           </w:p>
         </w:tc>
@@ -6010,7 +6010,7 @@
               <w:pStyle w:val="IMTable"/>
             </w:pPr>
             <w:r>
-              <w:t>Предварительный список затронутых BOM и конфликтов</w:t>
+              <w:t>Предварительный список затронутых модельный ряд и конфликтов</w:t>
             </w:r>
           </w:p>
         </w:tc>
@@ -6754,7 +6754,7 @@
               <w:pStyle w:val="IMTable"/>
             </w:pPr>
             <w:r>
-              <w:t>Перечень BOM и карточек, затронутых заменой компонента</w:t>
+              <w:t>Перечень модельных рядов и карточек, затронутых заменой компонента</w:t>
             </w:r>
           </w:p>
         </w:tc>
@@ -7103,7 +7103,7 @@
               <w:pStyle w:val="IMTable"/>
             </w:pPr>
             <w:r>
-              <w:t>Журнал изменений BOM и карточек с авторами и временем операций</w:t>
+              <w:t>Журнал изменений модельных рядов и карточек с авторами и временем операций</w:t>
             </w:r>
           </w:p>
         </w:tc>
@@ -7366,7 +7366,7 @@
         <w:pStyle w:val="IMBody"/>
       </w:pPr>
       <w:r>
-        <w:t>BOM — спецификация состава компьютера с кодами и количеством компонентов. Основной получатель информации — менеджер маркетплейсов. Он объединяет технические, коммерческие и визуальные сведения и передаёт результат на публикацию (см. практику 1).</w:t>
+        <w:t>модельный ряд — спецификация состава компьютера с кодами и количеством компонентов. Основной получатель информации — менеджер маркетплейсов. Он объединяет технические, коммерческие и визуальные сведения и передаёт результат на публикацию (см. практику 1).</w:t>
       </w:r>
     </w:p>
     <w:p>
@@ -7603,7 +7603,7 @@
               <w:pStyle w:val="IMTable"/>
             </w:pPr>
             <w:r>
-              <w:t>Кто утверждает BOM? Как проверяются совместимость и замены?</w:t>
+              <w:t>Кто утверждает модельный ряд? Как проверяются совместимость и замены?</w:t>
             </w:r>
           </w:p>
         </w:tc>
@@ -7757,7 +7757,7 @@
               <w:pStyle w:val="IMTable"/>
             </w:pPr>
             <w:r>
-              <w:t>Связь задания F08, файлов F09 и версии BOM</w:t>
+              <w:t>Связь задания F08, файлов F09 и версии модельного ряда</w:t>
             </w:r>
           </w:p>
         </w:tc>
@@ -8589,7 +8589,7 @@
               <w:pStyle w:val="IMTable"/>
             </w:pPr>
             <w:r>
-              <w:t>Идентификатор BOM, компонент и основание замены</w:t>
+              <w:t>Идентификатор модельный ряд, компонент и основание замены</w:t>
             </w:r>
           </w:p>
         </w:tc>
@@ -8636,7 +8636,7 @@
               <w:pStyle w:val="IMTable"/>
             </w:pPr>
             <w:r>
-              <w:t>Согласованная BOM</w:t>
+              <w:t>Согласованный модельный ряд</w:t>
             </w:r>
           </w:p>
         </w:tc>
@@ -9039,7 +9039,7 @@
               <w:pStyle w:val="IMTable"/>
             </w:pPr>
             <w:r>
-              <w:t>Расчёт цены и массы по BOM и предложениям</w:t>
+              <w:t>Расчёт цены и массы по модельный ряд и предложениям</w:t>
             </w:r>
           </w:p>
         </w:tc>
@@ -10585,7 +10585,7 @@
         <w:pStyle w:val="IMBody"/>
       </w:pPr>
       <w:r>
-        <w:t>Для связи документов используются код компонента, идентификатор BOM, номер её версии, идентификатор карточки и дата операции. Состав ключевых документов и правила заполнения представлены в таблице 2.4.</w:t>
+        <w:t>Для связи документов используются код компонента, идентификатор модельный ряд, номер её версии, идентификатор карточки и дата операции. Состав ключевых документов и правила заполнения представлены в таблице 2.4.</w:t>
       </w:r>
     </w:p>
     <w:p>
@@ -10718,7 +10718,7 @@
               <w:jc w:val="center"/>
             </w:pPr>
             <w:r>
-              <w:t>BOM, F04</w:t>
+              <w:t>модельный ряд, F04</w:t>
             </w:r>
           </w:p>
         </w:tc>
@@ -10738,7 +10738,7 @@
               <w:pStyle w:val="IMTable"/>
             </w:pPr>
             <w:r>
-              <w:t>Код и версия BOM; компонент; количество; автор; дата согласования</w:t>
+              <w:t>Код и версия модельного ряда; компонент; количество; автор; дата согласования</w:t>
             </w:r>
           </w:p>
         </w:tc>
@@ -10804,7 +10804,7 @@
               <w:pStyle w:val="IMTable"/>
             </w:pPr>
             <w:r>
-              <w:t>Версия BOM; цены; количества; затраты на сборку; наценка; масса</w:t>
+              <w:t>Версия модельного ряда; цены; количества; затраты на сборку; наценка; масса</w:t>
             </w:r>
           </w:p>
         </w:tc>
@@ -10870,7 +10870,7 @@
               <w:pStyle w:val="IMTable"/>
             </w:pPr>
             <w:r>
-              <w:t>Код карточки; версия BOM; название; характеристики; цена; масса; файлы</w:t>
+              <w:t>Код карточки; версия модельного ряда; название; характеристики; цена; масса; файлы</w:t>
             </w:r>
           </w:p>
         </w:tc>
@@ -11000,7 +11000,7 @@
         <w:pStyle w:val="IMBody"/>
       </w:pPr>
       <w:r>
-        <w:t>При актуализации карточки изменение цены F02 или остатка F05 требует проверки всех зависимых BOM. Изменение состава дополнительно возвращает работу к F03/F04, F07 и при необходимости F08/F09. Этот маршрут выявляет главный недостаток исходной технологии: связь между компонентом, спецификацией, расчётом и карточкой поддерживается вручную.</w:t>
+        <w:t>При актуализации карточки изменение цены F02 или остатка F05 требует проверки всех зависимых модельный ряд. Изменение состава дополнительно возвращает работу к F03/F04, F07 и при необходимости F08/F09. Этот маршрут выявляет главный недостаток исходной технологии: связь между компонентом, спецификацией, расчётом и карточкой поддерживается вручную.</w:t>
       </w:r>
     </w:p>
     <w:p>
@@ -11016,7 +11016,7 @@
         <w:pStyle w:val="IMBody"/>
       </w:pPr>
       <w:r>
-        <w:t>Всего выделено 14 информационных потоков. Ручное объединение F02/F04/F05, перенос F06 в F10, несогласованные версии F04/F09 и раздельная обратная связь F11/F12 затрудняют контроль. Для автоматизации необходимы единые идентификаторы, хранение версий, централизованный расчёт, проверка полноты и журнал публикаций. Результаты используются в практике 3 для постановки задач проекта и в практике 4 для модели «как есть».</w:t>
+        <w:t>Всего выделено 14 информационных потоков. Ручное объединение F02/F04/F05, перенос F06 в F10, несогласованные версии F04/F09 и раздельная обратная связь F11/F12 затрудняют контроль. Для автоматизации необходимы единые идентификаторы, хранение версий, централизованный расчёт, проверка полноты и журнал публикаций. Результаты используются в практике 3 для постановки задач проекта и в практике 4 для модели AS-IS.</w:t>
       </w:r>
     </w:p>
     <w:p>
@@ -11579,7 +11579,7 @@
               <w:pStyle w:val="IMTable"/>
             </w:pPr>
             <w:r>
-              <w:t>Нет полного списка зависимых BOM и карточек</w:t>
+              <w:t>Нет полного списка зависимых модельных рядов и карточек</w:t>
             </w:r>
           </w:p>
         </w:tc>
@@ -11959,7 +11959,7 @@
         <w:pStyle w:val="IMBody"/>
       </w:pPr>
       <w:r>
-        <w:t>Цель проекта — за 12 недель подготовить и внедрить пилот ИС, которая объединяет данные компонент–BOM–карточка, проверяет конфигурации и обязательные поля, рассчитывает параметры и сохраняет результаты публикаций. Пилот охватывает 100 операций подготовки или обновления карточек в течение 10 рабочих дней; набор операций резервируется заранее.</w:t>
+        <w:t>Цель проекта — за 12 недель подготовить и внедрить пилот ИС, которая объединяет данные компонент–модельный ряд–карточка, проверяет конфигурации и обязательные поля, рассчитывает параметры и сохраняет результаты публикаций. Пилот охватывает 100 операций подготовки или обновления карточек в течение 10 рабочих дней; набор операций резервируется заранее.</w:t>
       </w:r>
     </w:p>
     <w:p>
@@ -11967,7 +11967,7 @@
         <w:pStyle w:val="IMBody"/>
       </w:pPr>
       <w:r>
-        <w:t>Задачи проекта: формализовать справочники и версии; настроить загрузку цен и остатков; реализовать проверку совместимости и расчёт; связать изображения с BOM; организовать публикацию и повторную обработку; ввести историю действий, отчёты, обучение и контрольные испытания.</w:t>
+        <w:t>Задачи проекта: формализовать справочники и версии; настроить загрузку цен и остатков; реализовать проверку совместимости и расчёт; связать изображения с модельный ряд; организовать публикацию и повторную обработку; ввести историю действий, отчёты, обучение и контрольные испытания.</w:t>
       </w:r>
     </w:p>
     <w:p>
@@ -12281,7 +12281,7 @@
               <w:pStyle w:val="IMTable"/>
             </w:pPr>
             <w:r>
-              <w:t>Контрольный набор корректных и заведомо ошибочных BOM</w:t>
+              <w:t>Контрольный набор корректных и заведомо ошибочных модельный ряд</w:t>
             </w:r>
           </w:p>
         </w:tc>
@@ -12413,7 +12413,7 @@
               <w:pStyle w:val="IMTable"/>
             </w:pPr>
             <w:r>
-              <w:t>Каждая отправка связана с карточкой, версией BOM и ответом</w:t>
+              <w:t>Каждая отправка связана с карточкой, версией модельный ряд и ответом</w:t>
             </w:r>
           </w:p>
         </w:tc>
@@ -12951,7 +12951,7 @@
         <w:pStyle w:val="IMBody"/>
       </w:pPr>
       <w:r>
-        <w:t>В проект входят карточки, BOM, расчёты, изображения, публикации и отчётность. Вне проекта — замена складской системы, бухгалтерия, доставка, реклама и управление заказами. Новые требования принимаются только после оценки изменения трудоёмкости, срока и критериев приёмки.</w:t>
+        <w:t>В проект входят карточки, модельный ряд, расчёты, изображения, публикации и отчётность. Вне проекта — замена складской системы, бухгалтерия, доставка, реклама и управление заказами. Новые требования принимаются только после оценки изменения трудоёмкости, срока и критериев приёмки.</w:t>
       </w:r>
     </w:p>
     <w:p>
@@ -13279,7 +13279,7 @@
               <w:pStyle w:val="IMTable"/>
             </w:pPr>
             <w:r>
-              <w:t>Обследование и модель «как есть»</w:t>
+              <w:t>Обследование и модель AS-IS</w:t>
             </w:r>
           </w:p>
         </w:tc>
@@ -13619,7 +13619,7 @@
               <w:pStyle w:val="IMTable"/>
             </w:pPr>
             <w:r>
-              <w:t>Связи компонент–BOM–карточка и правила версий</w:t>
+              <w:t>Связи компонент–модельный ряд–карточка и правила версий</w:t>
             </w:r>
           </w:p>
         </w:tc>
@@ -13795,7 +13795,7 @@
               <w:pStyle w:val="IMTable"/>
             </w:pPr>
             <w:r>
-              <w:t>Справочники и BOM</w:t>
+              <w:t>Справочники и модельный ряд</w:t>
             </w:r>
           </w:p>
         </w:tc>
@@ -17895,7 +17895,7 @@
         <w:pStyle w:val="IMBody"/>
       </w:pPr>
       <w:r>
-        <w:t>На рисунке 4.1 приведена диаграмма A-0: входы I поступают слева, управление C — сверху, механизмы M — снизу, выходы O направлены вправо. Состав ресурсов раскрыт в таблице 4.1.</w:t>
+        <w:t>Состав ресурсов приведён в IDEF0-диаграмме.</w:t>
       </w:r>
     </w:p>
     <w:p>
@@ -17948,7 +17948,7 @@
         <w:pStyle w:val="IMFigureCaption"/>
       </w:pPr>
       <w:r>
-        <w:t>Рисунок 4.1 – Контекстная диаграмма A-0 процесса «как есть» в IDEF0</w:t>
+        <w:t>Рисунок 4.1 – Контекстная диаграмма A-0 процесса AS-IS в IDEF0</w:t>
       </w:r>
     </w:p>
     <w:p>
@@ -18144,7 +18144,7 @@
               <w:pStyle w:val="IMTable"/>
             </w:pPr>
             <w:r>
-              <w:t>Заявка и исходная BOM</w:t>
+              <w:t>Заявка и исходный модельный ряд</w:t>
             </w:r>
           </w:p>
         </w:tc>
@@ -19220,7 +19220,7 @@
         <w:pStyle w:val="IMFigureCaption"/>
       </w:pPr>
       <w:r>
-        <w:t>Рисунок 4.2 – Декомпозиция A0 процесса «как есть» в IDEF0</w:t>
+        <w:t>Рисунок 4.2 – Декомпозиция A0 процесса AS-IS в IDEF0</w:t>
       </w:r>
     </w:p>
     <w:p>
@@ -19529,7 +19529,7 @@
               <w:pStyle w:val="IMTable"/>
             </w:pPr>
             <w:r>
-              <w:t>D1: комплект данных и исходная BOM</w:t>
+              <w:t>D1: комплект данных и исходный модельный ряд</w:t>
             </w:r>
           </w:p>
         </w:tc>
@@ -19596,7 +19596,7 @@
               <w:pStyle w:val="IMTable"/>
             </w:pPr>
             <w:r>
-              <w:t>Проверить BOM и рассчитать параметры</w:t>
+              <w:t>Проверить модельный ряд и рассчитать параметры</w:t>
             </w:r>
           </w:p>
         </w:tc>
@@ -19656,7 +19656,7 @@
               <w:pStyle w:val="IMTable"/>
             </w:pPr>
             <w:r>
-              <w:t>D2: согласованная BOM, заключение и ведомость</w:t>
+              <w:t>D2: согласованный модельный ряд, заключение и ведомость</w:t>
             </w:r>
           </w:p>
         </w:tc>
@@ -19993,7 +19993,7 @@
         <w:pStyle w:val="IMBody"/>
       </w:pPr>
       <w:r>
-        <w:t>A3 включает подготовку названия и описания, перенос характеристик и расчётных значений, запрос изображений и итоговую сверку. Ручное заполнение разных форм создаёт риск несоответствия карточки последней версии BOM.</w:t>
+        <w:t>A3 включает подготовку названия и описания, перенос характеристик и расчётных значений, запрос изображений и итоговую сверку. Ручное заполнение разных форм создаёт риск несоответствия карточки последней версии модельного ряда.</w:t>
       </w:r>
     </w:p>
     <w:p>
@@ -20342,7 +20342,7 @@
               <w:pStyle w:val="IMTable"/>
             </w:pPr>
             <w:r>
-              <w:t>Высокое. Находить зависимые BOM и обновлять связанные карточки</w:t>
+              <w:t>Высокое. Находить зависимые модельный ряд и обновлять связанные карточки</w:t>
             </w:r>
           </w:p>
         </w:tc>
@@ -20554,7 +20554,7 @@
         <w:pStyle w:val="IMBody"/>
       </w:pPr>
       <w:r>
-        <w:t>Построены контекст и декомпозиция модели «как есть», описаны четыре функции и все граничные потоки. Основные недостатки связаны с ручной поддержкой соответствия документов и поздним обнаружением расхождений. В практике 5 эти операции преобразуются в единый управляемый процесс с автоматическими проверками и согласованием ответственных лиц.</w:t>
+        <w:t>Построены контекст и декомпозиция модели AS-IS, описаны четыре функции и все граничные потоки. Основные недостатки связаны с ручной поддержкой соответствия документов и поздним обнаружением расхождений. В практике 5 эти операции преобразуются в единый управляемый процесс с автоматическими проверками и согласованием ответственных лиц.</w:t>
       </w:r>
     </w:p>
     <w:p>
@@ -20581,7 +20581,7 @@
         <w:pStyle w:val="IMBody"/>
       </w:pPr>
       <w:r>
-        <w:t>Цель работы — разработать новую технологию формирования и актуализации карточек компьютерных систем ООО «Юкомс», определить изменённые потоки и подпроцессы, построить модель «как должно быть» и оценить ожидаемые результаты преобразования [1].</w:t>
+        <w:t>Цель работы — разработать новую технологию формирования и актуализации карточек компьютерных систем ООО «Юкомс», определить изменённые потоки и подпроцессы, построить модель TO-BE и оценить ожидаемые результаты преобразования [1].</w:t>
       </w:r>
     </w:p>
     <w:p>
@@ -20621,7 +20621,7 @@
         <w:pStyle w:val="IMBody"/>
       </w:pPr>
       <w:r>
-        <w:t>Данные о компонентах, предложениях, BOM и карточках хранятся в единой системе. Изменение компонента создаёт новую версию BOM и автоматически формирует перечень затронутых карточек. Расчёты и атрибуты формируются из согласованной версии, а не переносятся вручную между файлами.</w:t>
+        <w:t>Данные о компонентах, предложениях, модельный ряд и карточках хранятся в единой системе. Изменение компонента создаёт новую версию модельный ряд и автоматически формирует перечень затронутых карточек. Расчёты и атрибуты формируются из согласованной версии, а не переносятся вручную между файлами.</w:t>
       </w:r>
     </w:p>
     <w:p>
@@ -20739,7 +20739,7 @@
               <w:rPr>
                 <w:b/>
               </w:rPr>
-              <w:t>Как есть</w:t>
+              <w:t>AS-IS</w:t>
             </w:r>
           </w:p>
         </w:tc>
@@ -20763,7 +20763,7 @@
               <w:rPr>
                 <w:b/>
               </w:rPr>
-              <w:t>Как должно быть</w:t>
+              <w:t>TO-BE</w:t>
             </w:r>
           </w:p>
         </w:tc>
@@ -20854,7 +20854,7 @@
               <w:pStyle w:val="IMTable"/>
             </w:pPr>
             <w:r>
-              <w:t>Единые справочники; генерация расчётов и полей из версии BOM</w:t>
+              <w:t>Единые справочники; генерация расчётов и полей из версии модельного ряда</w:t>
             </w:r>
           </w:p>
         </w:tc>
@@ -20941,7 +20941,7 @@
               <w:pStyle w:val="IMTable"/>
             </w:pPr>
             <w:r>
-              <w:t>Проверка по справочнику правил до согласования BOM</w:t>
+              <w:t>Проверка по справочнику правил до согласования модельного ряда</w:t>
             </w:r>
           </w:p>
         </w:tc>
@@ -21382,7 +21382,7 @@
         <w:pStyle w:val="IMFigureCaption"/>
       </w:pPr>
       <w:r>
-        <w:t>Рисунок 5.1 – Контекстная диаграмма A-0 процесса «как должно быть»</w:t>
+        <w:t>Рисунок 5.1 – Контекстная диаграмма A-0 процесса TO-BE</w:t>
       </w:r>
     </w:p>
     <w:p>
@@ -21578,7 +21578,7 @@
               <w:pStyle w:val="IMTable"/>
             </w:pPr>
             <w:r>
-              <w:t>Заявка и исходная BOM</w:t>
+              <w:t>Заявка и исходный модельный ряд</w:t>
             </w:r>
           </w:p>
         </w:tc>
@@ -21618,7 +21618,7 @@
               <w:pStyle w:val="IMTable"/>
             </w:pPr>
             <w:r>
-              <w:t>Заявка с основанием и ссылкой на текущую версию BOM</w:t>
+              <w:t>Заявка с основанием и ссылкой на текущую версию модельный ряд</w:t>
             </w:r>
           </w:p>
         </w:tc>
@@ -21793,7 +21793,7 @@
               <w:pStyle w:val="IMTable"/>
             </w:pPr>
             <w:r>
-              <w:t>Файлы изображений, связанные с версией BOM</w:t>
+              <w:t>Файлы изображений, связанные с версией модельный ряд</w:t>
             </w:r>
           </w:p>
         </w:tc>
@@ -22740,7 +22740,7 @@
         <w:pStyle w:val="IMFigureCaption"/>
       </w:pPr>
       <w:r>
-        <w:t>Рисунок 5.2 – Декомпозиция A0 процесса «как должно быть»</w:t>
+        <w:t>Рисунок 5.2 – Декомпозиция A0 процесса TO-BE</w:t>
       </w:r>
     </w:p>
     <w:p>
@@ -23049,7 +23049,7 @@
               <w:pStyle w:val="IMTable"/>
             </w:pPr>
             <w:r>
-              <w:t>D1: нормализованные данные и исходная версия BOM</w:t>
+              <w:t>D1: нормализованные данные и исходная версия модельного ряда</w:t>
             </w:r>
           </w:p>
         </w:tc>
@@ -23116,7 +23116,7 @@
               <w:pStyle w:val="IMTable"/>
             </w:pPr>
             <w:r>
-              <w:t>Проверить версию BOM и согласовать</w:t>
+              <w:t>Проверить версию модельный ряд и согласовать</w:t>
             </w:r>
           </w:p>
         </w:tc>
@@ -23176,7 +23176,7 @@
               <w:pStyle w:val="IMTable"/>
             </w:pPr>
             <w:r>
-              <w:t>D2: утверждённая версия BOM, расчёт и контрольные документы</w:t>
+              <w:t>D2: утверждённая версия модельного ряда, расчёт и контрольные документы</w:t>
             </w:r>
           </w:p>
         </w:tc>
@@ -23643,7 +23643,7 @@
               <w:pStyle w:val="IMTable"/>
             </w:pPr>
             <w:r>
-              <w:t>Протокол совместимости: версия BOM, правило, результат, критичность</w:t>
+              <w:t>Протокол совместимости: версия модельного ряда, правило, результат, критичность</w:t>
             </w:r>
           </w:p>
         </w:tc>
@@ -23710,7 +23710,7 @@
               <w:pStyle w:val="IMTable"/>
             </w:pPr>
             <w:r>
-              <w:t>Перечень зависимых BOM и карточек при замене компонента</w:t>
+              <w:t>Перечень зависимых модельных рядов и карточек при замене компонента</w:t>
             </w:r>
           </w:p>
         </w:tc>
@@ -23942,7 +23942,7 @@
         <w:pStyle w:val="IMBody"/>
       </w:pPr>
       <w:r>
-        <w:t>Правило 1: версия BOM с критическим нарушением совместимости не допускается к утверждению. Правило 2: неизвестная цена, неоднозначный код или отрицательный доступный остаток создают задачу на уточнение, а не заменяются значением по умолчанию.</w:t>
+        <w:t>Правило 1: версия модельного ряда с критическим нарушением совместимости не допускается к утверждению. Правило 2: неизвестная цена, неоднозначный код или отрицательный доступный остаток создают задачу на уточнение, а не заменяются значением по умолчанию.</w:t>
       </w:r>
     </w:p>
     <w:p>
@@ -23999,7 +23999,7 @@
         <w:pStyle w:val="IMBody"/>
       </w:pPr>
       <w:r>
-        <w:t>Для контрольного примера компонент используется в трёх BOM и пяти карточках. N02 должен содержать ровно эти объекты без посторонних зависимостей. До согласования замены старые версии сохраняются; после согласования формируются новые расчёты и задания на изображения. Каждая из пяти карточек должна получить новый статус либо документированное исключение.</w:t>
+        <w:t>Для контрольного примера компонент используется в трёх модельный ряд и пяти карточках. N02 должен содержать ровно эти объекты без посторонних зависимостей. До согласования замены старые версии сохраняются; после согласования формируются новые расчёты и задания на изображения. Каждая из пяти карточек должна получить новый статус либо документированное исключение.</w:t>
       </w:r>
     </w:p>
     <w:p>
@@ -24049,7 +24049,7 @@
         <w:pStyle w:val="IMBody"/>
       </w:pPr>
       <w:r>
-        <w:t>В таблице 5.5 сопоставлены расчётный исходный сценарий и проектные цели. Значения «как есть» для времени и процента публикаций являются гипотезами планирования; фактическая база измеряется до пилота на сопоставимых операциях.</w:t>
+        <w:t>В таблице 5.5 сопоставлены расчётный исходный сценарий и проектные цели. Значения AS-IS для времени и процента публикаций являются гипотезами планирования; фактическая база измеряется до пилота на сопоставимых операциях.</w:t>
       </w:r>
     </w:p>
     <w:p>
@@ -24618,7 +24618,7 @@
               <w:pStyle w:val="IMTable"/>
             </w:pPr>
             <w:r>
-              <w:t>Число ошибочных BOM, прошедших контроль; протокол испытаний</w:t>
+              <w:t>Число ошибочных модельный ряд, прошедших контроль; протокол испытаний</w:t>
             </w:r>
           </w:p>
         </w:tc>
@@ -24671,7 +24671,7 @@
         <w:pStyle w:val="IMBody"/>
       </w:pPr>
       <w:r>
-        <w:t>Целевая ИС должна поддерживать общую БД компонентов, предложений, BOM и карточек; хранилище изображений; проверку правил; очередь публикаций; аудит и отчёты. Конкретный программный продукт выбирается после сравнения его возможностей с этими требованиями; одной замены текстового редактора недостаточно.</w:t>
+        <w:t>Целевая ИС должна поддерживать общую БД компонентов, предложений, модельных рядов и карточек; хранилище изображений; проверку правил; очередь публикаций; аудит и отчёты. Конкретный программный продукт выбирается после сравнения его возможностей с этими требованиями; одной замены текстового редактора недостаточно.</w:t>
       </w:r>
     </w:p>
     <w:p>
@@ -24728,7 +24728,7 @@
         <w:pStyle w:val="IMBody"/>
       </w:pPr>
       <w:r>
-        <w:t>Разработана модель новой технологии с четырьмя подпроцессами, общими данными, автоматическими проверками, управляемыми версиями и фиксацией публикаций. По сравнению с моделью «как есть» устранены основные причины повторного ввода, несогласованных замен и потери истории; согласование состава и коммерческого предложения закреплено за сотрудниками.</w:t>
+        <w:t>Разработана модель новой технологии с четырьмя подпроцессами, общими данными, автоматическими проверками, управляемыми версиями и фиксацией публикаций. По сравнению с моделью AS-IS устранены основные причины повторного ввода, несогласованных замен и потери истории; согласование состава и коммерческого предложения закреплено за сотрудниками.</w:t>
       </w:r>
     </w:p>
     <w:p>
@@ -29422,7 +29422,7 @@
         <w:pStyle w:val="IMBody"/>
       </w:pPr>
       <w:r>
-        <w:t>Для учебного проекта выбрана разработка компактного специализированного веб-приложения с готовой СУБД и отдельными адаптерами обмена. Разрабатываются правила и связи «компонент — версия BOM — карточка — попытка публикации». Существующий учёт организации не заменяется. Такой выбор позволяет прямо реализовать F-02–F-10 и ограничить первую поставку одним процессом и одним каналом.</w:t>
+        <w:t>Для учебного проекта выбрана разработка компактного специализированного веб-приложения с готовой СУБД и отдельными адаптерами обмена. Разрабатываются правила и связи «компонент — версия модельного ряда — карточка — попытка публикации». Существующий учёт организации не заменяется. Такой выбор позволяет прямо реализовать F-02–F-10 и ограничить первую поставку одним процессом и одним каналом.</w:t>
       </w:r>
     </w:p>
     <w:p>
@@ -31118,7 +31118,7 @@
         <w:pStyle w:val="IMBody"/>
       </w:pPr>
       <w:r>
-        <w:t>Предусловия: Выбрана согласованная BOM; доступны актуальные цены, масса, затраты на сборку и наценка.</w:t>
+        <w:t>Предусловия: Выбрана согласованный BOM; доступны актуальные цены, масса, затраты на сборку и наценка.</w:t>
       </w:r>
     </w:p>
     <w:p>
@@ -31215,7 +31215,7 @@
         <w:pStyle w:val="IMBody"/>
       </w:pPr>
       <w:r>
-        <w:t>Предусловия: Есть согласованная BOM, проверенные изображения и шаблон выбранной категории.</w:t>
+        <w:t>Предусловия: Есть согласованный BOM, проверенные изображения и шаблон выбранной категории.</w:t>
       </w:r>
     </w:p>
     <w:p>
@@ -44214,7 +44214,7 @@
         <w:pStyle w:val="IMBody"/>
       </w:pPr>
       <w:r>
-        <w:t>В практических работах 1–12 сформирован проект информационной системы подготовки и актуализации карточек компьютерных систем ООО «Юкомс». Обследован процесс и его участники, определены девять ожидаемых результатных потоков, формализованы 14 текущих информационных потоков и шесть проблем. Модели «как есть» и «как должно быть» показывают переход от раздельных файлов к связанным версиям BOM, расчётам, изображениям и управляемым публикациям.</w:t>
+        <w:t>В практических работах 1–12 сформирован проект информационной системы подготовки и актуализации карточек компьютерных систем ООО «Юкомс». Обследован процесс и его участники, определены девять ожидаемых результатных потоков, формализованы 14 текущих информационных потоков и шесть проблем. Модели AS-IS и TO-BE показывают переход от раздельных файлов к связанным версиям BOM, расчётам, изображениям и управляемым публикациям.</w:t>
       </w:r>
     </w:p>
     <w:p>

</xml_diff>